<commit_message>
Move growth-strategy and marketing-ROI items from Stage I to Stage II; 65/35 split
Co-Authored-By: Claude Sonnet 5 <noreply@anthropic.com>
Claude-Session: https://claude.ai/code/session_01N8pyC7kzrM7G1tXtxT56eA
</commit_message>
<xml_diff>
--- a/outputs/core-business-assessment/2026-10-08-core-business-assessment-stage1-core.docx
+++ b/outputs/core-business-assessment/2026-10-08-core-business-assessment-stage1-core.docx
@@ -134,7 +134,7 @@
           <w:sz w:val="18"/>
           <w:szCs w:val="18"/>
         </w:rPr>
-        <w:t xml:space="preserve">  (10 of 10 items)</w:t>
+        <w:t xml:space="preserve">  (9 of 10 items)</w:t>
       </w:r>
     </w:p>
     <w:p>
@@ -297,24 +297,6 @@
           <w:szCs w:val="21"/>
         </w:rPr>
         <w:t xml:space="preserve">I assess and upgrade my business plan every 90 days.</w:t>
-      </w:r>
-    </w:p>
-    <w:p>
-      <w:pPr>
-        <w:pStyle w:val="ListParagraph"/>
-        <w:numPr>
-          <w:ilvl w:val="0"/>
-          <w:numId w:val="1"/>
-        </w:numPr>
-        <w:spacing w:after="90"/>
-        <w:ind w:left="360"/>
-      </w:pPr>
-      <w:r>
-        <w:rPr>
-          <w:sz w:val="21"/>
-          <w:szCs w:val="21"/>
-        </w:rPr>
-        <w:t xml:space="preserve">I have identified key growth strategies that produce a competitive advantage and direct my decisions.</w:t>
       </w:r>
     </w:p>
     <w:p>
@@ -516,7 +498,7 @@
           <w:sz w:val="18"/>
           <w:szCs w:val="18"/>
         </w:rPr>
-        <w:t xml:space="preserve">  (9 of 10 items)</w:t>
+        <w:t xml:space="preserve">  (8 of 10 items)</w:t>
       </w:r>
     </w:p>
     <w:p>
@@ -643,24 +625,6 @@
           <w:szCs w:val="21"/>
         </w:rPr>
         <w:t xml:space="preserve">My collateral material consistently reflects the quality of my brand.</w:t>
-      </w:r>
-    </w:p>
-    <w:p>
-      <w:pPr>
-        <w:pStyle w:val="ListParagraph"/>
-        <w:numPr>
-          <w:ilvl w:val="0"/>
-          <w:numId w:val="1"/>
-        </w:numPr>
-        <w:spacing w:after="90"/>
-        <w:ind w:left="360"/>
-      </w:pPr>
-      <w:r>
-        <w:rPr>
-          <w:sz w:val="21"/>
-          <w:szCs w:val="21"/>
-        </w:rPr>
-        <w:t xml:space="preserve">I regularly evaluate the effectiveness of my marketing efforts to determine which methods provide the greatest rate of return.</w:t>
       </w:r>
     </w:p>
     <w:p>

</xml_diff>